<commit_message>
Added questions for self-check. Marked module 6 as done
</commit_message>
<xml_diff>
--- a/04.MessageBasedArchitecture/Hometask.docx
+++ b/04.MessageBasedArchitecture/Hometask.docx
@@ -533,12 +533,14 @@
           <w:rFonts w:ascii="Verdana" w:hAnsi="Verdana"/>
         </w:rPr>
       </w:pPr>
+      <w:bookmarkStart w:id="0" w:name="_Hlk218944918"/>
       <w:r>
         <w:rPr>
           <w:rFonts w:ascii="Verdana" w:hAnsi="Verdana"/>
         </w:rPr>
         <w:t>What are the advantages and disadvantages of using message broker?</w:t>
       </w:r>
+      <w:bookmarkEnd w:id="0"/>
     </w:p>
     <w:p>
       <w:pPr>
@@ -730,11 +732,486 @@
     <w:p>
       <w:pPr>
         <w:spacing w:before="100" w:beforeAutospacing="1" w:line="240" w:lineRule="auto"/>
+        <w:ind w:left="360"/>
         <w:jc w:val="both"/>
         <w:rPr>
           <w:rFonts w:ascii="Verdana" w:hAnsi="Verdana"/>
         </w:rPr>
       </w:pPr>
+      <w:r>
+        <w:rPr>
+          <w:rFonts w:ascii="Verdana" w:hAnsi="Verdana"/>
+        </w:rPr>
+        <w:t>Message Based Architecture</w:t>
+      </w:r>
+      <w:r>
+        <w:rPr>
+          <w:rFonts w:ascii="Verdana" w:hAnsi="Verdana"/>
+        </w:rPr>
+        <w:t xml:space="preserve"> is an </w:t>
+      </w:r>
+      <w:r>
+        <w:rPr>
+          <w:rFonts w:ascii="Verdana" w:hAnsi="Verdana"/>
+        </w:rPr>
+        <w:t>a</w:t>
+      </w:r>
+      <w:r>
+        <w:rPr>
+          <w:rFonts w:ascii="Verdana" w:hAnsi="Verdana"/>
+        </w:rPr>
+        <w:t>rchitecture</w:t>
+      </w:r>
+      <w:r>
+        <w:rPr>
+          <w:rFonts w:ascii="Verdana" w:hAnsi="Verdana"/>
+        </w:rPr>
+        <w:t xml:space="preserve"> that facilitates communication and data exchange through messages. It enables the transfer of data between applications via a communication channel that carries self-contained units of information, known as messages.</w:t>
+      </w:r>
+    </w:p>
+    <w:p>
+      <w:pPr>
+        <w:spacing w:before="100" w:beforeAutospacing="1" w:line="240" w:lineRule="auto"/>
+        <w:ind w:left="360"/>
+        <w:jc w:val="both"/>
+        <w:rPr>
+          <w:rFonts w:ascii="Verdana" w:hAnsi="Verdana"/>
+        </w:rPr>
+      </w:pPr>
+      <w:r>
+        <w:rPr>
+          <w:rFonts w:ascii="Verdana" w:hAnsi="Verdana"/>
+        </w:rPr>
+        <w:t xml:space="preserve">In a </w:t>
+      </w:r>
+      <w:r>
+        <w:rPr>
+          <w:rFonts w:ascii="Verdana" w:hAnsi="Verdana"/>
+        </w:rPr>
+        <w:t>Message B</w:t>
+      </w:r>
+      <w:r>
+        <w:rPr>
+          <w:rFonts w:ascii="Verdana" w:hAnsi="Verdana"/>
+        </w:rPr>
+        <w:t>ased communication environment, messages are sent and received asynchronously.</w:t>
+      </w:r>
+      <w:r>
+        <w:rPr>
+          <w:rFonts w:ascii="Verdana" w:hAnsi="Verdana"/>
+        </w:rPr>
+        <w:t xml:space="preserve"> </w:t>
+      </w:r>
+      <w:r>
+        <w:rPr>
+          <w:rFonts w:ascii="Verdana" w:hAnsi="Verdana"/>
+        </w:rPr>
+        <w:t>I</w:t>
+      </w:r>
+      <w:r>
+        <w:rPr>
+          <w:rFonts w:ascii="Verdana" w:hAnsi="Verdana"/>
+        </w:rPr>
+        <w:t xml:space="preserve">n Message Driven systems, each component </w:t>
+      </w:r>
+      <w:r>
+        <w:rPr>
+          <w:rFonts w:ascii="Verdana" w:hAnsi="Verdana"/>
+        </w:rPr>
+        <w:t>sends</w:t>
+      </w:r>
+      <w:r>
+        <w:rPr>
+          <w:rFonts w:ascii="Verdana" w:hAnsi="Verdana"/>
+        </w:rPr>
+        <w:t xml:space="preserve"> items to a fixed recipient.</w:t>
+      </w:r>
+    </w:p>
+    <w:p>
+      <w:pPr>
+        <w:spacing w:before="100" w:beforeAutospacing="1" w:line="240" w:lineRule="auto"/>
+        <w:ind w:left="360"/>
+        <w:jc w:val="both"/>
+        <w:rPr>
+          <w:rFonts w:ascii="Verdana" w:hAnsi="Verdana"/>
+        </w:rPr>
+      </w:pPr>
+      <w:r>
+        <w:rPr>
+          <w:rFonts w:ascii="Verdana" w:hAnsi="Verdana"/>
+        </w:rPr>
+        <w:t>In Event Driven systems, on the other hand, each component produces items of data with a fixed sender and shares them with any consumer.</w:t>
+      </w:r>
+    </w:p>
+    <w:p>
+      <w:pPr>
+        <w:numPr>
+          <w:ilvl w:val="0"/>
+          <w:numId w:val="14"/>
+        </w:numPr>
+        <w:spacing w:before="100" w:beforeAutospacing="1" w:line="240" w:lineRule="auto"/>
+        <w:jc w:val="both"/>
+        <w:rPr>
+          <w:rFonts w:ascii="Verdana" w:hAnsi="Verdana"/>
+        </w:rPr>
+      </w:pPr>
+      <w:r>
+        <w:rPr>
+          <w:rFonts w:ascii="Verdana" w:hAnsi="Verdana"/>
+        </w:rPr>
+        <w:t>What is Message Broker? How do message brokers work?</w:t>
+      </w:r>
+    </w:p>
+    <w:p>
+      <w:pPr>
+        <w:spacing w:before="100" w:beforeAutospacing="1" w:line="240" w:lineRule="auto"/>
+        <w:ind w:left="360"/>
+        <w:jc w:val="both"/>
+        <w:rPr>
+          <w:rFonts w:ascii="Verdana" w:hAnsi="Verdana"/>
+        </w:rPr>
+      </w:pPr>
+      <w:r>
+        <w:rPr>
+          <w:rFonts w:ascii="Verdana" w:hAnsi="Verdana"/>
+        </w:rPr>
+        <w:t>A message broker is a piece of software, which enables services and applications to communicate with each other using messages. The message structure is formally defined and independent from the services that send them.</w:t>
+      </w:r>
+      <w:r>
+        <w:rPr>
+          <w:rFonts w:ascii="Verdana" w:hAnsi="Verdana"/>
+        </w:rPr>
+        <w:t xml:space="preserve"> </w:t>
+      </w:r>
+      <w:r>
+        <w:rPr>
+          <w:rFonts w:ascii="Verdana" w:hAnsi="Verdana"/>
+        </w:rPr>
+        <w:t xml:space="preserve">This allows applications to share information with one another, even if </w:t>
+      </w:r>
+      <w:r>
+        <w:rPr>
+          <w:rFonts w:ascii="Verdana" w:hAnsi="Verdana"/>
+        </w:rPr>
+        <w:t>it’s</w:t>
+      </w:r>
+      <w:r>
+        <w:rPr>
+          <w:rFonts w:ascii="Verdana" w:hAnsi="Verdana"/>
+        </w:rPr>
+        <w:t xml:space="preserve"> written in different programming languages</w:t>
+      </w:r>
+      <w:r>
+        <w:rPr>
+          <w:rFonts w:ascii="Verdana" w:hAnsi="Verdana"/>
+        </w:rPr>
+        <w:t>.</w:t>
+      </w:r>
+    </w:p>
+    <w:p>
+      <w:pPr>
+        <w:spacing w:before="100" w:beforeAutospacing="1" w:line="240" w:lineRule="auto"/>
+        <w:ind w:left="360"/>
+        <w:jc w:val="both"/>
+        <w:rPr>
+          <w:rFonts w:ascii="Verdana" w:hAnsi="Verdana"/>
+        </w:rPr>
+      </w:pPr>
+      <w:r>
+        <w:rPr>
+          <w:rFonts w:ascii="Verdana" w:hAnsi="Verdana"/>
+        </w:rPr>
+        <w:t>B</w:t>
+      </w:r>
+      <w:r>
+        <w:rPr>
+          <w:rFonts w:ascii="Verdana" w:hAnsi="Verdana"/>
+        </w:rPr>
+        <w:t>asic concepts of a message broker:</w:t>
+      </w:r>
+    </w:p>
+    <w:p>
+      <w:pPr>
+        <w:pStyle w:val="ListParagraph"/>
+        <w:numPr>
+          <w:ilvl w:val="0"/>
+          <w:numId w:val="15"/>
+        </w:numPr>
+        <w:rPr>
+          <w:rFonts w:ascii="Verdana" w:hAnsi="Verdana"/>
+        </w:rPr>
+      </w:pPr>
+      <w:r>
+        <w:rPr>
+          <w:rFonts w:ascii="Verdana" w:hAnsi="Verdana"/>
+        </w:rPr>
+        <w:t>Producer</w:t>
+      </w:r>
+      <w:r>
+        <w:rPr>
+          <w:rFonts w:ascii="Verdana" w:hAnsi="Verdana"/>
+        </w:rPr>
+        <w:t xml:space="preserve"> -</w:t>
+      </w:r>
+      <w:r>
+        <w:rPr>
+          <w:rFonts w:ascii="Verdana" w:hAnsi="Verdana"/>
+        </w:rPr>
+        <w:t xml:space="preserve"> </w:t>
+      </w:r>
+      <w:r>
+        <w:rPr>
+          <w:rFonts w:ascii="Verdana" w:hAnsi="Verdana"/>
+        </w:rPr>
+        <w:t>the application responsible for sending messages. It's connected with the message broker.</w:t>
+      </w:r>
+    </w:p>
+    <w:p>
+      <w:pPr>
+        <w:pStyle w:val="ListParagraph"/>
+        <w:numPr>
+          <w:ilvl w:val="0"/>
+          <w:numId w:val="15"/>
+        </w:numPr>
+        <w:spacing w:before="100" w:beforeAutospacing="1" w:line="240" w:lineRule="auto"/>
+        <w:jc w:val="both"/>
+        <w:rPr>
+          <w:rFonts w:ascii="Verdana" w:hAnsi="Verdana"/>
+        </w:rPr>
+      </w:pPr>
+      <w:r>
+        <w:rPr>
+          <w:rFonts w:ascii="Verdana" w:hAnsi="Verdana"/>
+        </w:rPr>
+        <w:t>Consumer</w:t>
+      </w:r>
+      <w:r>
+        <w:rPr>
+          <w:rFonts w:ascii="Verdana" w:hAnsi="Verdana"/>
+        </w:rPr>
+        <w:t xml:space="preserve"> - </w:t>
+      </w:r>
+      <w:r>
+        <w:rPr>
+          <w:rFonts w:ascii="Verdana" w:hAnsi="Verdana"/>
+        </w:rPr>
+        <w:t>the endpoint that consumes messages waiting in the message broker.</w:t>
+      </w:r>
+    </w:p>
+    <w:p>
+      <w:pPr>
+        <w:pStyle w:val="ListParagraph"/>
+        <w:numPr>
+          <w:ilvl w:val="0"/>
+          <w:numId w:val="15"/>
+        </w:numPr>
+        <w:spacing w:before="100" w:beforeAutospacing="1" w:line="240" w:lineRule="auto"/>
+        <w:jc w:val="both"/>
+        <w:rPr>
+          <w:rFonts w:ascii="Verdana" w:hAnsi="Verdana"/>
+        </w:rPr>
+      </w:pPr>
+      <w:r>
+        <w:rPr>
+          <w:rFonts w:ascii="Verdana" w:hAnsi="Verdana"/>
+        </w:rPr>
+        <w:t>Queue/topic</w:t>
+      </w:r>
+      <w:r>
+        <w:rPr>
+          <w:rFonts w:ascii="Verdana" w:hAnsi="Verdana"/>
+        </w:rPr>
+        <w:t xml:space="preserve"> - </w:t>
+      </w:r>
+      <w:r>
+        <w:rPr>
+          <w:rFonts w:ascii="Verdana" w:hAnsi="Verdana"/>
+        </w:rPr>
+        <w:t xml:space="preserve">a folder in a filesystem. Message </w:t>
+      </w:r>
+      <w:r>
+        <w:rPr>
+          <w:rFonts w:ascii="Verdana" w:hAnsi="Verdana"/>
+        </w:rPr>
+        <w:t>brokers use</w:t>
+      </w:r>
+      <w:r>
+        <w:rPr>
+          <w:rFonts w:ascii="Verdana" w:hAnsi="Verdana"/>
+        </w:rPr>
+        <w:t xml:space="preserve"> them to store messages.</w:t>
+      </w:r>
+    </w:p>
+    <w:p>
+      <w:pPr>
+        <w:pStyle w:val="ListParagraph"/>
+        <w:spacing w:before="100" w:beforeAutospacing="1" w:line="240" w:lineRule="auto"/>
+        <w:ind w:left="1080"/>
+        <w:jc w:val="both"/>
+        <w:rPr>
+          <w:rFonts w:ascii="Verdana" w:hAnsi="Verdana"/>
+        </w:rPr>
+      </w:pPr>
+    </w:p>
+    <w:p>
+      <w:pPr>
+        <w:pStyle w:val="ListParagraph"/>
+        <w:numPr>
+          <w:ilvl w:val="0"/>
+          <w:numId w:val="14"/>
+        </w:numPr>
+        <w:spacing w:before="100" w:beforeAutospacing="1" w:line="240" w:lineRule="auto"/>
+        <w:jc w:val="both"/>
+        <w:rPr>
+          <w:rFonts w:ascii="Verdana" w:hAnsi="Verdana"/>
+        </w:rPr>
+      </w:pPr>
+      <w:r>
+        <w:rPr>
+          <w:rFonts w:ascii="Verdana" w:hAnsi="Verdana"/>
+        </w:rPr>
+        <w:t>When should you use message brokers?</w:t>
+      </w:r>
+    </w:p>
+    <w:p>
+      <w:pPr>
+        <w:pStyle w:val="ListParagraph"/>
+        <w:spacing w:before="100" w:beforeAutospacing="1" w:line="240" w:lineRule="auto"/>
+        <w:jc w:val="both"/>
+        <w:rPr>
+          <w:rFonts w:ascii="Verdana" w:hAnsi="Verdana"/>
+        </w:rPr>
+      </w:pPr>
+    </w:p>
+    <w:p>
+      <w:pPr>
+        <w:pStyle w:val="ListParagraph"/>
+        <w:numPr>
+          <w:ilvl w:val="0"/>
+          <w:numId w:val="16"/>
+        </w:numPr>
+        <w:spacing w:before="100" w:beforeAutospacing="1" w:line="240" w:lineRule="auto"/>
+        <w:jc w:val="both"/>
+        <w:rPr>
+          <w:rFonts w:ascii="Verdana" w:hAnsi="Verdana"/>
+        </w:rPr>
+      </w:pPr>
+      <w:r>
+        <w:rPr>
+          <w:rFonts w:ascii="Verdana" w:hAnsi="Verdana"/>
+        </w:rPr>
+        <w:t>Long-running tasks and crucial API</w:t>
+      </w:r>
+      <w:r>
+        <w:rPr>
+          <w:rFonts w:ascii="Verdana" w:hAnsi="Verdana"/>
+        </w:rPr>
+        <w:t>.</w:t>
+      </w:r>
+    </w:p>
+    <w:p>
+      <w:pPr>
+        <w:pStyle w:val="ListParagraph"/>
+        <w:numPr>
+          <w:ilvl w:val="0"/>
+          <w:numId w:val="16"/>
+        </w:numPr>
+        <w:spacing w:before="100" w:beforeAutospacing="1" w:line="240" w:lineRule="auto"/>
+        <w:jc w:val="both"/>
+        <w:rPr>
+          <w:rFonts w:ascii="Verdana" w:hAnsi="Verdana"/>
+        </w:rPr>
+      </w:pPr>
+      <w:r>
+        <w:rPr>
+          <w:rFonts w:ascii="Verdana" w:hAnsi="Verdana"/>
+        </w:rPr>
+        <w:t>Microservices</w:t>
+      </w:r>
+      <w:r>
+        <w:rPr>
+          <w:rFonts w:ascii="Verdana" w:hAnsi="Verdana"/>
+        </w:rPr>
+        <w:t>.</w:t>
+      </w:r>
+    </w:p>
+    <w:p>
+      <w:pPr>
+        <w:pStyle w:val="ListParagraph"/>
+        <w:numPr>
+          <w:ilvl w:val="0"/>
+          <w:numId w:val="16"/>
+        </w:numPr>
+        <w:spacing w:before="100" w:beforeAutospacing="1" w:line="240" w:lineRule="auto"/>
+        <w:jc w:val="both"/>
+        <w:rPr>
+          <w:rFonts w:ascii="Verdana" w:hAnsi="Verdana"/>
+        </w:rPr>
+      </w:pPr>
+      <w:r>
+        <w:rPr>
+          <w:rFonts w:ascii="Verdana" w:hAnsi="Verdana"/>
+        </w:rPr>
+        <w:t>Mobile applications</w:t>
+      </w:r>
+      <w:r>
+        <w:rPr>
+          <w:rFonts w:ascii="Verdana" w:hAnsi="Verdana"/>
+        </w:rPr>
+        <w:t>.</w:t>
+      </w:r>
+    </w:p>
+    <w:p>
+      <w:pPr>
+        <w:pStyle w:val="ListParagraph"/>
+        <w:numPr>
+          <w:ilvl w:val="0"/>
+          <w:numId w:val="16"/>
+        </w:numPr>
+        <w:spacing w:before="100" w:beforeAutospacing="1" w:line="240" w:lineRule="auto"/>
+        <w:jc w:val="both"/>
+        <w:rPr>
+          <w:rFonts w:ascii="Verdana" w:hAnsi="Verdana"/>
+        </w:rPr>
+      </w:pPr>
+      <w:r>
+        <w:rPr>
+          <w:rFonts w:ascii="Verdana" w:hAnsi="Verdana"/>
+        </w:rPr>
+        <w:t>Transactional systems</w:t>
+      </w:r>
+      <w:r>
+        <w:rPr>
+          <w:rFonts w:ascii="Verdana" w:hAnsi="Verdana"/>
+        </w:rPr>
+        <w:t>.</w:t>
+      </w:r>
+    </w:p>
+    <w:p>
+      <w:pPr>
+        <w:pStyle w:val="ListParagraph"/>
+        <w:numPr>
+          <w:ilvl w:val="0"/>
+          <w:numId w:val="16"/>
+        </w:numPr>
+        <w:spacing w:before="100" w:beforeAutospacing="1" w:line="240" w:lineRule="auto"/>
+        <w:jc w:val="both"/>
+        <w:rPr>
+          <w:rFonts w:ascii="Verdana" w:hAnsi="Verdana"/>
+        </w:rPr>
+      </w:pPr>
+      <w:r>
+        <w:rPr>
+          <w:rFonts w:ascii="Verdana" w:hAnsi="Verdana"/>
+        </w:rPr>
+        <w:t>Controlling data feeds</w:t>
+      </w:r>
+      <w:r>
+        <w:rPr>
+          <w:rFonts w:ascii="Verdana" w:hAnsi="Verdana"/>
+        </w:rPr>
+        <w:t>.</w:t>
+      </w:r>
     </w:p>
     <w:p>
       <w:pPr>
@@ -745,6 +1222,836 @@
           <w:rFonts w:ascii="Verdana" w:hAnsi="Verdana"/>
         </w:rPr>
       </w:pPr>
+      <w:r>
+        <w:rPr>
+          <w:rFonts w:ascii="Verdana" w:hAnsi="Verdana"/>
+        </w:rPr>
+        <w:lastRenderedPageBreak/>
+        <w:t xml:space="preserve">In short, if you have actions in your system which: are </w:t>
+      </w:r>
+      <w:proofErr w:type="gramStart"/>
+      <w:r>
+        <w:rPr>
+          <w:rFonts w:ascii="Verdana" w:hAnsi="Verdana"/>
+        </w:rPr>
+        <w:t>time and resource</w:t>
+      </w:r>
+      <w:proofErr w:type="gramEnd"/>
+      <w:r>
+        <w:rPr>
+          <w:rFonts w:ascii="Verdana" w:hAnsi="Verdana"/>
+        </w:rPr>
+        <w:t xml:space="preserve">-consuming and </w:t>
+      </w:r>
+      <w:r>
+        <w:rPr>
+          <w:rFonts w:ascii="Verdana" w:hAnsi="Verdana"/>
+        </w:rPr>
+        <w:t>don’t</w:t>
+      </w:r>
+      <w:r>
+        <w:rPr>
+          <w:rFonts w:ascii="Verdana" w:hAnsi="Verdana"/>
+        </w:rPr>
+        <w:t xml:space="preserve"> require you to return the result of the operation immediately</w:t>
+      </w:r>
+      <w:r>
+        <w:rPr>
+          <w:rFonts w:ascii="Verdana" w:hAnsi="Verdana"/>
+        </w:rPr>
+        <w:t xml:space="preserve"> </w:t>
+      </w:r>
+      <w:r>
+        <w:rPr>
+          <w:rFonts w:ascii="Verdana" w:hAnsi="Verdana"/>
+        </w:rPr>
+        <w:t>then the message broker is for you.</w:t>
+      </w:r>
+    </w:p>
+    <w:p>
+      <w:pPr>
+        <w:pStyle w:val="ListParagraph"/>
+        <w:numPr>
+          <w:ilvl w:val="0"/>
+          <w:numId w:val="14"/>
+        </w:numPr>
+        <w:spacing w:before="100" w:beforeAutospacing="1" w:line="240" w:lineRule="auto"/>
+        <w:jc w:val="both"/>
+        <w:rPr>
+          <w:rFonts w:ascii="Verdana" w:hAnsi="Verdana"/>
+        </w:rPr>
+      </w:pPr>
+      <w:r>
+        <w:rPr>
+          <w:rFonts w:ascii="Verdana" w:hAnsi="Verdana"/>
+        </w:rPr>
+        <w:t>Name and describe any distribution pattern.</w:t>
+      </w:r>
+    </w:p>
+    <w:p>
+      <w:pPr>
+        <w:pStyle w:val="ListParagraph"/>
+        <w:spacing w:before="100" w:beforeAutospacing="1" w:line="240" w:lineRule="auto"/>
+        <w:jc w:val="both"/>
+        <w:rPr>
+          <w:rFonts w:ascii="Verdana" w:hAnsi="Verdana"/>
+        </w:rPr>
+      </w:pPr>
+    </w:p>
+    <w:p>
+      <w:pPr>
+        <w:pStyle w:val="ListParagraph"/>
+        <w:spacing w:before="100" w:beforeAutospacing="1" w:line="240" w:lineRule="auto"/>
+        <w:jc w:val="both"/>
+        <w:rPr>
+          <w:rFonts w:ascii="Verdana" w:hAnsi="Verdana"/>
+        </w:rPr>
+      </w:pPr>
+      <w:r>
+        <w:rPr>
+          <w:rFonts w:ascii="Verdana" w:hAnsi="Verdana"/>
+        </w:rPr>
+        <w:t>Point-to-point messaging</w:t>
+      </w:r>
+      <w:r>
+        <w:rPr>
+          <w:rFonts w:ascii="Verdana" w:hAnsi="Verdana"/>
+        </w:rPr>
+        <w:t>.</w:t>
+      </w:r>
+    </w:p>
+    <w:p>
+      <w:pPr>
+        <w:pStyle w:val="ListParagraph"/>
+        <w:spacing w:before="100" w:beforeAutospacing="1" w:line="240" w:lineRule="auto"/>
+        <w:jc w:val="both"/>
+        <w:rPr>
+          <w:rFonts w:ascii="Verdana" w:hAnsi="Verdana"/>
+        </w:rPr>
+      </w:pPr>
+      <w:r>
+        <w:rPr>
+          <w:rFonts w:ascii="Verdana" w:hAnsi="Verdana"/>
+          <w:noProof/>
+        </w:rPr>
+        <w:drawing>
+          <wp:inline distT="0" distB="0" distL="0" distR="0" wp14:anchorId="681B58CE" wp14:editId="77E8A112">
+            <wp:extent cx="5471160" cy="2173266"/>
+            <wp:effectExtent l="0" t="0" r="0" b="0"/>
+            <wp:docPr id="1836263097" name="Picture 1"/>
+            <wp:cNvGraphicFramePr>
+              <a:graphicFrameLocks xmlns:a="http://schemas.openxmlformats.org/drawingml/2006/main" noChangeAspect="1"/>
+            </wp:cNvGraphicFramePr>
+            <a:graphic xmlns:a="http://schemas.openxmlformats.org/drawingml/2006/main">
+              <a:graphicData uri="http://schemas.openxmlformats.org/drawingml/2006/picture">
+                <pic:pic xmlns:pic="http://schemas.openxmlformats.org/drawingml/2006/picture">
+                  <pic:nvPicPr>
+                    <pic:cNvPr id="0" name="Picture 2"/>
+                    <pic:cNvPicPr>
+                      <a:picLocks noChangeAspect="1" noChangeArrowheads="1"/>
+                    </pic:cNvPicPr>
+                  </pic:nvPicPr>
+                  <pic:blipFill>
+                    <a:blip r:embed="rId6">
+                      <a:extLst>
+                        <a:ext uri="{28A0092B-C50C-407E-A947-70E740481C1C}">
+                          <a14:useLocalDpi xmlns:a14="http://schemas.microsoft.com/office/drawing/2010/main" val="0"/>
+                        </a:ext>
+                      </a:extLst>
+                    </a:blip>
+                    <a:srcRect/>
+                    <a:stretch>
+                      <a:fillRect/>
+                    </a:stretch>
+                  </pic:blipFill>
+                  <pic:spPr bwMode="auto">
+                    <a:xfrm>
+                      <a:off x="0" y="0"/>
+                      <a:ext cx="5485640" cy="2179018"/>
+                    </a:xfrm>
+                    <a:prstGeom prst="rect">
+                      <a:avLst/>
+                    </a:prstGeom>
+                    <a:noFill/>
+                  </pic:spPr>
+                </pic:pic>
+              </a:graphicData>
+            </a:graphic>
+          </wp:inline>
+        </w:drawing>
+      </w:r>
+    </w:p>
+    <w:p>
+      <w:pPr>
+        <w:pStyle w:val="ListParagraph"/>
+        <w:spacing w:before="100" w:beforeAutospacing="1" w:line="240" w:lineRule="auto"/>
+        <w:jc w:val="both"/>
+        <w:rPr>
+          <w:rFonts w:ascii="Verdana" w:hAnsi="Verdana"/>
+        </w:rPr>
+      </w:pPr>
+      <w:r>
+        <w:rPr>
+          <w:rFonts w:ascii="Verdana" w:hAnsi="Verdana"/>
+        </w:rPr>
+        <w:t>In this pattern, there is one-to-one relation set between the sender and the receiver of the message. Each message is sent and consumed only once. We can use this pattern for example, when some action needs to be performed only once.</w:t>
+      </w:r>
+    </w:p>
+    <w:p>
+      <w:pPr>
+        <w:pStyle w:val="ListParagraph"/>
+        <w:spacing w:before="100" w:beforeAutospacing="1" w:line="240" w:lineRule="auto"/>
+        <w:jc w:val="both"/>
+        <w:rPr>
+          <w:rFonts w:ascii="Verdana" w:hAnsi="Verdana"/>
+        </w:rPr>
+      </w:pPr>
+      <w:r>
+        <w:rPr>
+          <w:rFonts w:ascii="Verdana" w:hAnsi="Verdana"/>
+        </w:rPr>
+        <w:t>T</w:t>
+      </w:r>
+      <w:r>
+        <w:rPr>
+          <w:rFonts w:ascii="Verdana" w:hAnsi="Verdana"/>
+        </w:rPr>
+        <w:t>he difference between this and some REST API</w:t>
+      </w:r>
+      <w:r>
+        <w:rPr>
+          <w:rFonts w:ascii="Verdana" w:hAnsi="Verdana"/>
+        </w:rPr>
+        <w:t xml:space="preserve"> is that t</w:t>
+      </w:r>
+      <w:r>
+        <w:rPr>
+          <w:rFonts w:ascii="Verdana" w:hAnsi="Verdana"/>
+        </w:rPr>
+        <w:t>he message broker guarantees that message will not be lost in case of failure of the consumer. It's stored safely in the message broker queue.</w:t>
+      </w:r>
+    </w:p>
+    <w:p>
+      <w:pPr>
+        <w:pStyle w:val="ListParagraph"/>
+        <w:spacing w:before="100" w:beforeAutospacing="1" w:line="240" w:lineRule="auto"/>
+        <w:jc w:val="both"/>
+        <w:rPr>
+          <w:rFonts w:ascii="Verdana" w:hAnsi="Verdana"/>
+        </w:rPr>
+      </w:pPr>
+    </w:p>
+    <w:p>
+      <w:pPr>
+        <w:pStyle w:val="ListParagraph"/>
+        <w:numPr>
+          <w:ilvl w:val="0"/>
+          <w:numId w:val="14"/>
+        </w:numPr>
+        <w:spacing w:before="100" w:beforeAutospacing="1" w:line="240" w:lineRule="auto"/>
+        <w:jc w:val="both"/>
+        <w:rPr>
+          <w:rFonts w:ascii="Verdana" w:hAnsi="Verdana"/>
+        </w:rPr>
+      </w:pPr>
+      <w:r>
+        <w:rPr>
+          <w:rFonts w:ascii="Verdana" w:hAnsi="Verdana"/>
+        </w:rPr>
+        <w:t>What are the advantages and disadvantages of using message broker?</w:t>
+      </w:r>
+    </w:p>
+    <w:p>
+      <w:pPr>
+        <w:spacing w:before="100" w:beforeAutospacing="1" w:line="240" w:lineRule="auto"/>
+        <w:ind w:left="720"/>
+        <w:jc w:val="both"/>
+        <w:rPr>
+          <w:rFonts w:ascii="Verdana" w:hAnsi="Verdana"/>
+        </w:rPr>
+      </w:pPr>
+      <w:r>
+        <w:rPr>
+          <w:rFonts w:ascii="Verdana" w:hAnsi="Verdana"/>
+        </w:rPr>
+        <w:t>A</w:t>
+      </w:r>
+      <w:r>
+        <w:rPr>
+          <w:rFonts w:ascii="Verdana" w:hAnsi="Verdana"/>
+        </w:rPr>
+        <w:t>dvantages of using the message broker</w:t>
+      </w:r>
+      <w:r>
+        <w:rPr>
+          <w:rFonts w:ascii="Verdana" w:hAnsi="Verdana"/>
+        </w:rPr>
+        <w:t>:</w:t>
+      </w:r>
+    </w:p>
+    <w:p>
+      <w:pPr>
+        <w:pStyle w:val="ListParagraph"/>
+        <w:numPr>
+          <w:ilvl w:val="0"/>
+          <w:numId w:val="17"/>
+        </w:numPr>
+        <w:spacing w:before="100" w:beforeAutospacing="1" w:line="240" w:lineRule="auto"/>
+        <w:jc w:val="both"/>
+        <w:rPr>
+          <w:rFonts w:ascii="Verdana" w:hAnsi="Verdana"/>
+        </w:rPr>
+      </w:pPr>
+      <w:r>
+        <w:rPr>
+          <w:rFonts w:ascii="Verdana" w:hAnsi="Verdana"/>
+        </w:rPr>
+        <w:t>Provided communication between services that may not be running at the same time.</w:t>
+      </w:r>
+    </w:p>
+    <w:p>
+      <w:pPr>
+        <w:pStyle w:val="ListParagraph"/>
+        <w:numPr>
+          <w:ilvl w:val="0"/>
+          <w:numId w:val="17"/>
+        </w:numPr>
+        <w:spacing w:before="100" w:beforeAutospacing="1" w:line="240" w:lineRule="auto"/>
+        <w:jc w:val="both"/>
+        <w:rPr>
+          <w:rFonts w:ascii="Verdana" w:hAnsi="Verdana"/>
+        </w:rPr>
+      </w:pPr>
+      <w:r>
+        <w:rPr>
+          <w:rFonts w:ascii="Verdana" w:hAnsi="Verdana"/>
+        </w:rPr>
+        <w:t>Improved system performance by introducing asynchronous processing.</w:t>
+      </w:r>
+    </w:p>
+    <w:p>
+      <w:pPr>
+        <w:pStyle w:val="ListParagraph"/>
+        <w:numPr>
+          <w:ilvl w:val="0"/>
+          <w:numId w:val="17"/>
+        </w:numPr>
+        <w:spacing w:before="100" w:beforeAutospacing="1" w:line="240" w:lineRule="auto"/>
+        <w:jc w:val="both"/>
+        <w:rPr>
+          <w:rFonts w:ascii="Verdana" w:hAnsi="Verdana"/>
+        </w:rPr>
+      </w:pPr>
+      <w:r>
+        <w:rPr>
+          <w:rFonts w:ascii="Verdana" w:hAnsi="Verdana"/>
+        </w:rPr>
+        <w:t>Increased reliability by guaranteeing the transmission of messages.</w:t>
+      </w:r>
+    </w:p>
+    <w:p>
+      <w:pPr>
+        <w:spacing w:before="100" w:beforeAutospacing="1" w:line="240" w:lineRule="auto"/>
+        <w:ind w:left="720"/>
+        <w:jc w:val="both"/>
+        <w:rPr>
+          <w:rFonts w:ascii="Verdana" w:hAnsi="Verdana"/>
+        </w:rPr>
+      </w:pPr>
+      <w:r>
+        <w:rPr>
+          <w:rFonts w:ascii="Verdana" w:hAnsi="Verdana"/>
+        </w:rPr>
+        <w:t>D</w:t>
+      </w:r>
+      <w:r>
+        <w:rPr>
+          <w:rFonts w:ascii="Verdana" w:hAnsi="Verdana"/>
+        </w:rPr>
+        <w:t>isadvantages of using the message broker</w:t>
+      </w:r>
+      <w:r>
+        <w:rPr>
+          <w:rFonts w:ascii="Verdana" w:hAnsi="Verdana"/>
+        </w:rPr>
+        <w:t>:</w:t>
+      </w:r>
+    </w:p>
+    <w:p>
+      <w:pPr>
+        <w:pStyle w:val="ListParagraph"/>
+        <w:numPr>
+          <w:ilvl w:val="0"/>
+          <w:numId w:val="18"/>
+        </w:numPr>
+        <w:spacing w:before="100" w:beforeAutospacing="1" w:line="240" w:lineRule="auto"/>
+        <w:jc w:val="both"/>
+        <w:rPr>
+          <w:rFonts w:ascii="Verdana" w:hAnsi="Verdana"/>
+        </w:rPr>
+      </w:pPr>
+      <w:r>
+        <w:rPr>
+          <w:rFonts w:ascii="Verdana" w:hAnsi="Verdana"/>
+        </w:rPr>
+        <w:t>Increased system complexity.</w:t>
+      </w:r>
+    </w:p>
+    <w:p>
+      <w:pPr>
+        <w:pStyle w:val="ListParagraph"/>
+        <w:numPr>
+          <w:ilvl w:val="0"/>
+          <w:numId w:val="18"/>
+        </w:numPr>
+        <w:spacing w:before="100" w:beforeAutospacing="1" w:line="240" w:lineRule="auto"/>
+        <w:jc w:val="both"/>
+        <w:rPr>
+          <w:rFonts w:ascii="Verdana" w:hAnsi="Verdana"/>
+        </w:rPr>
+      </w:pPr>
+      <w:r>
+        <w:rPr>
+          <w:rFonts w:ascii="Verdana" w:hAnsi="Verdana"/>
+        </w:rPr>
+        <w:t>Debugging can be harder.</w:t>
+      </w:r>
+    </w:p>
+    <w:p>
+      <w:pPr>
+        <w:pStyle w:val="ListParagraph"/>
+        <w:numPr>
+          <w:ilvl w:val="0"/>
+          <w:numId w:val="18"/>
+        </w:numPr>
+        <w:spacing w:before="100" w:beforeAutospacing="1" w:line="240" w:lineRule="auto"/>
+        <w:jc w:val="both"/>
+        <w:rPr>
+          <w:rFonts w:ascii="Verdana" w:hAnsi="Verdana"/>
+        </w:rPr>
+      </w:pPr>
+      <w:r>
+        <w:rPr>
+          <w:rFonts w:ascii="Verdana" w:hAnsi="Verdana"/>
+        </w:rPr>
+        <w:t>There’s a steep learning curve at first.</w:t>
+      </w:r>
+    </w:p>
+    <w:p>
+      <w:pPr>
+        <w:spacing w:before="100" w:beforeAutospacing="1" w:line="240" w:lineRule="auto"/>
+        <w:jc w:val="both"/>
+        <w:rPr>
+          <w:rFonts w:ascii="Verdana" w:hAnsi="Verdana"/>
+        </w:rPr>
+      </w:pPr>
+    </w:p>
+    <w:p>
+      <w:pPr>
+        <w:pStyle w:val="ListParagraph"/>
+        <w:numPr>
+          <w:ilvl w:val="0"/>
+          <w:numId w:val="14"/>
+        </w:numPr>
+        <w:spacing w:before="100" w:beforeAutospacing="1" w:line="240" w:lineRule="auto"/>
+        <w:jc w:val="both"/>
+        <w:rPr>
+          <w:rFonts w:ascii="Verdana" w:hAnsi="Verdana"/>
+        </w:rPr>
+      </w:pPr>
+      <w:r>
+        <w:rPr>
+          <w:rFonts w:ascii="Verdana" w:hAnsi="Verdana"/>
+        </w:rPr>
+        <w:lastRenderedPageBreak/>
+        <w:t>What is the difference between Queue and Topic?</w:t>
+      </w:r>
+    </w:p>
+    <w:p>
+      <w:pPr>
+        <w:ind w:left="360"/>
+        <w:jc w:val="both"/>
+        <w:rPr>
+          <w:rFonts w:ascii="Verdana" w:hAnsi="Verdana"/>
+        </w:rPr>
+      </w:pPr>
+      <w:r>
+        <w:rPr>
+          <w:rFonts w:ascii="Verdana" w:hAnsi="Verdana"/>
+        </w:rPr>
+        <w:t>Queues are a fundamental building block in messaging systems designed for one-to-one communication. In a queue-based architecture, messages are sent to a specific queue and processed by a single receiver.</w:t>
+      </w:r>
+    </w:p>
+    <w:p>
+      <w:pPr>
+        <w:ind w:left="360"/>
+        <w:jc w:val="both"/>
+        <w:rPr>
+          <w:rFonts w:ascii="Verdana" w:hAnsi="Verdana"/>
+        </w:rPr>
+      </w:pPr>
+      <w:r>
+        <w:rPr>
+          <w:rFonts w:ascii="Verdana" w:hAnsi="Verdana"/>
+        </w:rPr>
+        <w:t xml:space="preserve">Topics, on the other hand, are designed for one-to-many communication scenarios. In </w:t>
+      </w:r>
+      <w:r>
+        <w:rPr>
+          <w:rFonts w:ascii="Verdana" w:hAnsi="Verdana"/>
+        </w:rPr>
+        <w:t>topic</w:t>
+      </w:r>
+      <w:r>
+        <w:rPr>
+          <w:rFonts w:ascii="Verdana" w:hAnsi="Verdana"/>
+        </w:rPr>
+        <w:t>-based architecture, messages are published to a topic and can be consumed by multiple subscribers who have an interest in receiving those messages. Topics allow for broadcast-style communication, where messages are delivered to all interested parties.</w:t>
+      </w:r>
+    </w:p>
+    <w:p>
+      <w:pPr>
+        <w:ind w:left="360"/>
+        <w:rPr>
+          <w:rFonts w:ascii="Verdana" w:hAnsi="Verdana"/>
+        </w:rPr>
+      </w:pPr>
+      <w:r>
+        <w:rPr>
+          <w:rFonts w:ascii="Verdana" w:hAnsi="Verdana"/>
+        </w:rPr>
+        <w:t>7.</w:t>
+      </w:r>
+      <w:r>
+        <w:rPr>
+          <w:rFonts w:ascii="Verdana" w:hAnsi="Verdana"/>
+        </w:rPr>
+        <w:tab/>
+        <w:t>What are the typical failures in MBA? How can you address them? What is Saga pattern?</w:t>
+      </w:r>
+    </w:p>
+    <w:p>
+      <w:pPr>
+        <w:ind w:left="360"/>
+        <w:rPr>
+          <w:rFonts w:ascii="Verdana" w:hAnsi="Verdana"/>
+        </w:rPr>
+      </w:pPr>
+      <w:r>
+        <w:rPr>
+          <w:rFonts w:ascii="Verdana" w:hAnsi="Verdana"/>
+        </w:rPr>
+        <w:t>T</w:t>
+      </w:r>
+      <w:r>
+        <w:rPr>
+          <w:rFonts w:ascii="Verdana" w:hAnsi="Verdana"/>
+        </w:rPr>
+        <w:t>ypical failures</w:t>
+      </w:r>
+      <w:r>
+        <w:rPr>
+          <w:rFonts w:ascii="Verdana" w:hAnsi="Verdana"/>
+        </w:rPr>
+        <w:t xml:space="preserve"> in MBA</w:t>
+      </w:r>
+      <w:r>
+        <w:rPr>
+          <w:rFonts w:ascii="Verdana" w:hAnsi="Verdana"/>
+        </w:rPr>
+        <w:t>:</w:t>
+      </w:r>
+    </w:p>
+    <w:p>
+      <w:pPr>
+        <w:pStyle w:val="ListParagraph"/>
+        <w:numPr>
+          <w:ilvl w:val="0"/>
+          <w:numId w:val="19"/>
+        </w:numPr>
+        <w:rPr>
+          <w:rFonts w:ascii="Verdana" w:hAnsi="Verdana"/>
+        </w:rPr>
+      </w:pPr>
+      <w:r>
+        <w:rPr>
+          <w:rFonts w:ascii="Verdana" w:hAnsi="Verdana"/>
+        </w:rPr>
+        <w:t>Failed return result</w:t>
+      </w:r>
+      <w:r>
+        <w:rPr>
+          <w:rFonts w:ascii="Verdana" w:hAnsi="Verdana"/>
+        </w:rPr>
+        <w:t>.</w:t>
+      </w:r>
+    </w:p>
+    <w:p>
+      <w:pPr>
+        <w:pStyle w:val="ListParagraph"/>
+        <w:numPr>
+          <w:ilvl w:val="0"/>
+          <w:numId w:val="19"/>
+        </w:numPr>
+        <w:rPr>
+          <w:rFonts w:ascii="Verdana" w:hAnsi="Verdana"/>
+        </w:rPr>
+      </w:pPr>
+      <w:r>
+        <w:rPr>
+          <w:rFonts w:ascii="Verdana" w:hAnsi="Verdana"/>
+        </w:rPr>
+        <w:t>Remote service down</w:t>
+      </w:r>
+      <w:r>
+        <w:rPr>
+          <w:rFonts w:ascii="Verdana" w:hAnsi="Verdana"/>
+        </w:rPr>
+        <w:t>.</w:t>
+      </w:r>
+    </w:p>
+    <w:p>
+      <w:pPr>
+        <w:pStyle w:val="ListParagraph"/>
+        <w:numPr>
+          <w:ilvl w:val="0"/>
+          <w:numId w:val="19"/>
+        </w:numPr>
+        <w:rPr>
+          <w:rFonts w:ascii="Verdana" w:hAnsi="Verdana"/>
+        </w:rPr>
+      </w:pPr>
+      <w:r>
+        <w:rPr>
+          <w:rFonts w:ascii="Verdana" w:hAnsi="Verdana"/>
+        </w:rPr>
+        <w:t>Event routing fails</w:t>
+      </w:r>
+      <w:r>
+        <w:rPr>
+          <w:rFonts w:ascii="Verdana" w:hAnsi="Verdana"/>
+        </w:rPr>
+        <w:t>.</w:t>
+      </w:r>
+    </w:p>
+    <w:p>
+      <w:pPr>
+        <w:pStyle w:val="ListParagraph"/>
+        <w:numPr>
+          <w:ilvl w:val="0"/>
+          <w:numId w:val="19"/>
+        </w:numPr>
+        <w:rPr>
+          <w:rFonts w:ascii="Verdana" w:hAnsi="Verdana"/>
+        </w:rPr>
+      </w:pPr>
+      <w:r>
+        <w:rPr>
+          <w:rFonts w:ascii="Verdana" w:hAnsi="Verdana"/>
+        </w:rPr>
+        <w:t>Event-handling system down</w:t>
+      </w:r>
+      <w:r>
+        <w:rPr>
+          <w:rFonts w:ascii="Verdana" w:hAnsi="Verdana"/>
+        </w:rPr>
+        <w:t>.</w:t>
+      </w:r>
+    </w:p>
+    <w:p>
+      <w:pPr>
+        <w:ind w:left="360"/>
+        <w:rPr>
+          <w:rFonts w:ascii="Verdana" w:hAnsi="Verdana"/>
+        </w:rPr>
+      </w:pPr>
+      <w:r>
+        <w:rPr>
+          <w:rFonts w:ascii="Verdana" w:hAnsi="Verdana"/>
+        </w:rPr>
+        <w:t xml:space="preserve">The </w:t>
+      </w:r>
+      <w:r>
+        <w:rPr>
+          <w:rFonts w:ascii="Verdana" w:hAnsi="Verdana"/>
+        </w:rPr>
+        <w:t>ways to address typical failures are:</w:t>
+      </w:r>
+    </w:p>
+    <w:p>
+      <w:pPr>
+        <w:ind w:left="360"/>
+        <w:rPr>
+          <w:rFonts w:ascii="Verdana" w:hAnsi="Verdana"/>
+          <w:b/>
+          <w:bCs/>
+        </w:rPr>
+      </w:pPr>
+      <w:r>
+        <w:rPr>
+          <w:rFonts w:ascii="Verdana" w:hAnsi="Verdana"/>
+          <w:b/>
+          <w:bCs/>
+        </w:rPr>
+        <w:t>Dead letter queues</w:t>
+      </w:r>
+      <w:r>
+        <w:rPr>
+          <w:rFonts w:ascii="Verdana" w:hAnsi="Verdana"/>
+          <w:b/>
+          <w:bCs/>
+        </w:rPr>
+        <w:t>.</w:t>
+      </w:r>
+    </w:p>
+    <w:p>
+      <w:pPr>
+        <w:pStyle w:val="ListParagraph"/>
+        <w:ind w:left="360"/>
+        <w:jc w:val="both"/>
+        <w:rPr>
+          <w:rFonts w:ascii="Verdana" w:hAnsi="Verdana"/>
+        </w:rPr>
+      </w:pPr>
+      <w:r>
+        <w:rPr>
+          <w:rFonts w:ascii="Verdana" w:hAnsi="Verdana"/>
+        </w:rPr>
+        <w:t>A "dead letter" queue is a repository of messages that, for whatever reason, were never picked up and processed by the intended recipient. At regular intervals, an implemented cleanup-routine mechanism can comb through the dead letter queue, determine the issue and handle these lost messages as appropriate.</w:t>
+      </w:r>
+      <w:r>
+        <w:rPr>
+          <w:rFonts w:ascii="Verdana" w:hAnsi="Verdana"/>
+        </w:rPr>
+        <w:t xml:space="preserve"> </w:t>
+      </w:r>
+      <w:r>
+        <w:rPr>
+          <w:rFonts w:ascii="Verdana" w:hAnsi="Verdana"/>
+        </w:rPr>
+        <w:t>This routine can also be programmed to come through and resubmit old jobs, if needed. At the very least, it can notify requesting systems that the intended recipient is down.</w:t>
+      </w:r>
+    </w:p>
+    <w:p>
+      <w:pPr>
+        <w:ind w:left="360"/>
+        <w:rPr>
+          <w:rFonts w:ascii="Verdana" w:hAnsi="Verdana"/>
+          <w:b/>
+          <w:bCs/>
+        </w:rPr>
+      </w:pPr>
+      <w:r>
+        <w:rPr>
+          <w:rFonts w:ascii="Verdana" w:hAnsi="Verdana"/>
+          <w:b/>
+          <w:bCs/>
+        </w:rPr>
+        <w:t>Logs and alerts.</w:t>
+      </w:r>
+    </w:p>
+    <w:p>
+      <w:pPr>
+        <w:pStyle w:val="ListParagraph"/>
+        <w:ind w:left="360"/>
+        <w:jc w:val="both"/>
+        <w:rPr>
+          <w:rFonts w:ascii="Verdana" w:hAnsi="Verdana"/>
+        </w:rPr>
+      </w:pPr>
+      <w:r>
+        <w:rPr>
+          <w:rFonts w:ascii="Verdana" w:hAnsi="Verdana"/>
+        </w:rPr>
+        <w:t>The system that sends or receives the failure may want to write alerts to a log that something went wrong. These alerts can manifest as things like web pages, emails, instant messages or phone calls that the user can interact with.</w:t>
+      </w:r>
+      <w:r>
+        <w:rPr>
+          <w:rFonts w:ascii="Verdana" w:hAnsi="Verdana"/>
+        </w:rPr>
+        <w:t xml:space="preserve"> </w:t>
+      </w:r>
+      <w:r>
+        <w:rPr>
+          <w:rFonts w:ascii="Verdana" w:hAnsi="Verdana"/>
+        </w:rPr>
+        <w:t xml:space="preserve">These messages should have enough context that an administrator can dive in, debug and fix the problem. One way to stay consistent with alerts is for development teams to provide their own support, implementing a rotating schedule that assigns certain developers </w:t>
+      </w:r>
+      <w:r>
+        <w:rPr>
+          <w:rFonts w:ascii="Verdana" w:hAnsi="Verdana"/>
+        </w:rPr>
+        <w:lastRenderedPageBreak/>
+        <w:t>to support roles that take responsibility for debugs, fixes and, when needed, escalations.</w:t>
+      </w:r>
+    </w:p>
+    <w:p>
+      <w:pPr>
+        <w:ind w:left="360"/>
+        <w:rPr>
+          <w:rFonts w:ascii="Verdana" w:hAnsi="Verdana"/>
+          <w:b/>
+          <w:bCs/>
+        </w:rPr>
+      </w:pPr>
+      <w:r>
+        <w:rPr>
+          <w:rFonts w:ascii="Verdana" w:hAnsi="Verdana"/>
+          <w:b/>
+          <w:bCs/>
+        </w:rPr>
+        <w:t>Saga pattern</w:t>
+      </w:r>
+      <w:r>
+        <w:rPr>
+          <w:rFonts w:ascii="Verdana" w:hAnsi="Verdana"/>
+          <w:b/>
+          <w:bCs/>
+        </w:rPr>
+        <w:t>.</w:t>
+      </w:r>
+    </w:p>
+    <w:p>
+      <w:pPr>
+        <w:ind w:left="360"/>
+        <w:jc w:val="both"/>
+        <w:rPr>
+          <w:rFonts w:ascii="Verdana" w:hAnsi="Verdana"/>
+        </w:rPr>
+      </w:pPr>
+      <w:r>
+        <w:rPr>
+          <w:rFonts w:ascii="Verdana" w:hAnsi="Verdana"/>
+        </w:rPr>
+        <w:t xml:space="preserve">The saga pattern uses both a messaging bus and a "controller" mechanism that receives events from that bus and turns them into process-based messages. This controller could be something like a finite state machine that simulates sequential logic -- anything that can take the message, determine where it came from, </w:t>
+      </w:r>
+      <w:r>
+        <w:rPr>
+          <w:rFonts w:ascii="Verdana" w:hAnsi="Verdana"/>
+        </w:rPr>
+        <w:t>analyzes</w:t>
+      </w:r>
+      <w:r>
+        <w:rPr>
+          <w:rFonts w:ascii="Verdana" w:hAnsi="Verdana"/>
+        </w:rPr>
+        <w:t xml:space="preserve"> its status and then process the next command. For example, this can be accomplished using a switch statement, or a set of nested IF commands.</w:t>
+      </w:r>
+    </w:p>
+    <w:p>
+      <w:pPr>
+        <w:ind w:left="360"/>
+        <w:jc w:val="both"/>
+        <w:rPr>
+          <w:rFonts w:ascii="Verdana" w:hAnsi="Verdana"/>
+        </w:rPr>
+      </w:pPr>
+      <w:r>
+        <w:rPr>
+          <w:rFonts w:ascii="Verdana" w:hAnsi="Verdana"/>
+        </w:rPr>
+        <w:t>This implements a somewhat sophisticated rollback system for event-driven architecture failures, as the service can inform the bus of a failure, prompting the controller to fire rollback instructions to each service along the executed chain. However, keep in mind that this controller mechanism adds a good deal more code, which can quickly turn a relatively simple application system into a complex web of dependencies and potential bugs.</w:t>
+      </w:r>
     </w:p>
     <w:sectPr>
       <w:pgSz w:w="12240" w:h="15840"/>
@@ -872,6 +2179,119 @@
     </w:lvl>
   </w:abstractNum>
   <w:abstractNum w:abstractNumId="1" w15:restartNumberingAfterBreak="0">
+    <w:nsid w:val="04BA7AB8"/>
+    <w:multiLevelType w:val="hybridMultilevel"/>
+    <w:tmpl w:val="612A02A0"/>
+    <w:lvl w:ilvl="0" w:tplc="04090001">
+      <w:start w:val="1"/>
+      <w:numFmt w:val="bullet"/>
+      <w:lvlText w:val=""/>
+      <w:lvlJc w:val="left"/>
+      <w:pPr>
+        <w:ind w:left="1080" w:hanging="360"/>
+      </w:pPr>
+      <w:rPr>
+        <w:rFonts w:ascii="Symbol" w:hAnsi="Symbol" w:hint="default"/>
+      </w:rPr>
+    </w:lvl>
+    <w:lvl w:ilvl="1" w:tplc="04090003" w:tentative="1">
+      <w:start w:val="1"/>
+      <w:numFmt w:val="bullet"/>
+      <w:lvlText w:val="o"/>
+      <w:lvlJc w:val="left"/>
+      <w:pPr>
+        <w:ind w:left="1800" w:hanging="360"/>
+      </w:pPr>
+      <w:rPr>
+        <w:rFonts w:ascii="Courier New" w:hAnsi="Courier New" w:cs="Courier New" w:hint="default"/>
+      </w:rPr>
+    </w:lvl>
+    <w:lvl w:ilvl="2" w:tplc="04090005" w:tentative="1">
+      <w:start w:val="1"/>
+      <w:numFmt w:val="bullet"/>
+      <w:lvlText w:val=""/>
+      <w:lvlJc w:val="left"/>
+      <w:pPr>
+        <w:ind w:left="2520" w:hanging="360"/>
+      </w:pPr>
+      <w:rPr>
+        <w:rFonts w:ascii="Wingdings" w:hAnsi="Wingdings" w:hint="default"/>
+      </w:rPr>
+    </w:lvl>
+    <w:lvl w:ilvl="3" w:tplc="04090001" w:tentative="1">
+      <w:start w:val="1"/>
+      <w:numFmt w:val="bullet"/>
+      <w:lvlText w:val=""/>
+      <w:lvlJc w:val="left"/>
+      <w:pPr>
+        <w:ind w:left="3240" w:hanging="360"/>
+      </w:pPr>
+      <w:rPr>
+        <w:rFonts w:ascii="Symbol" w:hAnsi="Symbol" w:hint="default"/>
+      </w:rPr>
+    </w:lvl>
+    <w:lvl w:ilvl="4" w:tplc="04090003" w:tentative="1">
+      <w:start w:val="1"/>
+      <w:numFmt w:val="bullet"/>
+      <w:lvlText w:val="o"/>
+      <w:lvlJc w:val="left"/>
+      <w:pPr>
+        <w:ind w:left="3960" w:hanging="360"/>
+      </w:pPr>
+      <w:rPr>
+        <w:rFonts w:ascii="Courier New" w:hAnsi="Courier New" w:cs="Courier New" w:hint="default"/>
+      </w:rPr>
+    </w:lvl>
+    <w:lvl w:ilvl="5" w:tplc="04090005" w:tentative="1">
+      <w:start w:val="1"/>
+      <w:numFmt w:val="bullet"/>
+      <w:lvlText w:val=""/>
+      <w:lvlJc w:val="left"/>
+      <w:pPr>
+        <w:ind w:left="4680" w:hanging="360"/>
+      </w:pPr>
+      <w:rPr>
+        <w:rFonts w:ascii="Wingdings" w:hAnsi="Wingdings" w:hint="default"/>
+      </w:rPr>
+    </w:lvl>
+    <w:lvl w:ilvl="6" w:tplc="04090001" w:tentative="1">
+      <w:start w:val="1"/>
+      <w:numFmt w:val="bullet"/>
+      <w:lvlText w:val=""/>
+      <w:lvlJc w:val="left"/>
+      <w:pPr>
+        <w:ind w:left="5400" w:hanging="360"/>
+      </w:pPr>
+      <w:rPr>
+        <w:rFonts w:ascii="Symbol" w:hAnsi="Symbol" w:hint="default"/>
+      </w:rPr>
+    </w:lvl>
+    <w:lvl w:ilvl="7" w:tplc="04090003" w:tentative="1">
+      <w:start w:val="1"/>
+      <w:numFmt w:val="bullet"/>
+      <w:lvlText w:val="o"/>
+      <w:lvlJc w:val="left"/>
+      <w:pPr>
+        <w:ind w:left="6120" w:hanging="360"/>
+      </w:pPr>
+      <w:rPr>
+        <w:rFonts w:ascii="Courier New" w:hAnsi="Courier New" w:cs="Courier New" w:hint="default"/>
+      </w:rPr>
+    </w:lvl>
+    <w:lvl w:ilvl="8" w:tplc="04090005" w:tentative="1">
+      <w:start w:val="1"/>
+      <w:numFmt w:val="bullet"/>
+      <w:lvlText w:val=""/>
+      <w:lvlJc w:val="left"/>
+      <w:pPr>
+        <w:ind w:left="6840" w:hanging="360"/>
+      </w:pPr>
+      <w:rPr>
+        <w:rFonts w:ascii="Wingdings" w:hAnsi="Wingdings" w:hint="default"/>
+      </w:rPr>
+    </w:lvl>
+  </w:abstractNum>
+  <w:abstractNum w:abstractNumId="2" w15:restartNumberingAfterBreak="0">
     <w:nsid w:val="0BC1220A"/>
     <w:multiLevelType w:val="multilevel"/>
     <w:tmpl w:val="84589E32"/>
@@ -1009,7 +2429,120 @@
       </w:rPr>
     </w:lvl>
   </w:abstractNum>
-  <w:abstractNum w:abstractNumId="2" w15:restartNumberingAfterBreak="0">
+  <w:abstractNum w:abstractNumId="3" w15:restartNumberingAfterBreak="0">
+    <w:nsid w:val="0BD4059A"/>
+    <w:multiLevelType w:val="hybridMultilevel"/>
+    <w:tmpl w:val="3290438A"/>
+    <w:lvl w:ilvl="0" w:tplc="04090001">
+      <w:start w:val="1"/>
+      <w:numFmt w:val="bullet"/>
+      <w:lvlText w:val=""/>
+      <w:lvlJc w:val="left"/>
+      <w:pPr>
+        <w:ind w:left="1080" w:hanging="360"/>
+      </w:pPr>
+      <w:rPr>
+        <w:rFonts w:ascii="Symbol" w:hAnsi="Symbol" w:hint="default"/>
+      </w:rPr>
+    </w:lvl>
+    <w:lvl w:ilvl="1" w:tplc="04090003" w:tentative="1">
+      <w:start w:val="1"/>
+      <w:numFmt w:val="bullet"/>
+      <w:lvlText w:val="o"/>
+      <w:lvlJc w:val="left"/>
+      <w:pPr>
+        <w:ind w:left="1800" w:hanging="360"/>
+      </w:pPr>
+      <w:rPr>
+        <w:rFonts w:ascii="Courier New" w:hAnsi="Courier New" w:cs="Courier New" w:hint="default"/>
+      </w:rPr>
+    </w:lvl>
+    <w:lvl w:ilvl="2" w:tplc="04090005" w:tentative="1">
+      <w:start w:val="1"/>
+      <w:numFmt w:val="bullet"/>
+      <w:lvlText w:val=""/>
+      <w:lvlJc w:val="left"/>
+      <w:pPr>
+        <w:ind w:left="2520" w:hanging="360"/>
+      </w:pPr>
+      <w:rPr>
+        <w:rFonts w:ascii="Wingdings" w:hAnsi="Wingdings" w:hint="default"/>
+      </w:rPr>
+    </w:lvl>
+    <w:lvl w:ilvl="3" w:tplc="04090001" w:tentative="1">
+      <w:start w:val="1"/>
+      <w:numFmt w:val="bullet"/>
+      <w:lvlText w:val=""/>
+      <w:lvlJc w:val="left"/>
+      <w:pPr>
+        <w:ind w:left="3240" w:hanging="360"/>
+      </w:pPr>
+      <w:rPr>
+        <w:rFonts w:ascii="Symbol" w:hAnsi="Symbol" w:hint="default"/>
+      </w:rPr>
+    </w:lvl>
+    <w:lvl w:ilvl="4" w:tplc="04090003" w:tentative="1">
+      <w:start w:val="1"/>
+      <w:numFmt w:val="bullet"/>
+      <w:lvlText w:val="o"/>
+      <w:lvlJc w:val="left"/>
+      <w:pPr>
+        <w:ind w:left="3960" w:hanging="360"/>
+      </w:pPr>
+      <w:rPr>
+        <w:rFonts w:ascii="Courier New" w:hAnsi="Courier New" w:cs="Courier New" w:hint="default"/>
+      </w:rPr>
+    </w:lvl>
+    <w:lvl w:ilvl="5" w:tplc="04090005" w:tentative="1">
+      <w:start w:val="1"/>
+      <w:numFmt w:val="bullet"/>
+      <w:lvlText w:val=""/>
+      <w:lvlJc w:val="left"/>
+      <w:pPr>
+        <w:ind w:left="4680" w:hanging="360"/>
+      </w:pPr>
+      <w:rPr>
+        <w:rFonts w:ascii="Wingdings" w:hAnsi="Wingdings" w:hint="default"/>
+      </w:rPr>
+    </w:lvl>
+    <w:lvl w:ilvl="6" w:tplc="04090001" w:tentative="1">
+      <w:start w:val="1"/>
+      <w:numFmt w:val="bullet"/>
+      <w:lvlText w:val=""/>
+      <w:lvlJc w:val="left"/>
+      <w:pPr>
+        <w:ind w:left="5400" w:hanging="360"/>
+      </w:pPr>
+      <w:rPr>
+        <w:rFonts w:ascii="Symbol" w:hAnsi="Symbol" w:hint="default"/>
+      </w:rPr>
+    </w:lvl>
+    <w:lvl w:ilvl="7" w:tplc="04090003" w:tentative="1">
+      <w:start w:val="1"/>
+      <w:numFmt w:val="bullet"/>
+      <w:lvlText w:val="o"/>
+      <w:lvlJc w:val="left"/>
+      <w:pPr>
+        <w:ind w:left="6120" w:hanging="360"/>
+      </w:pPr>
+      <w:rPr>
+        <w:rFonts w:ascii="Courier New" w:hAnsi="Courier New" w:cs="Courier New" w:hint="default"/>
+      </w:rPr>
+    </w:lvl>
+    <w:lvl w:ilvl="8" w:tplc="04090005" w:tentative="1">
+      <w:start w:val="1"/>
+      <w:numFmt w:val="bullet"/>
+      <w:lvlText w:val=""/>
+      <w:lvlJc w:val="left"/>
+      <w:pPr>
+        <w:ind w:left="6840" w:hanging="360"/>
+      </w:pPr>
+      <w:rPr>
+        <w:rFonts w:ascii="Wingdings" w:hAnsi="Wingdings" w:hint="default"/>
+      </w:rPr>
+    </w:lvl>
+  </w:abstractNum>
+  <w:abstractNum w:abstractNumId="4" w15:restartNumberingAfterBreak="0">
     <w:nsid w:val="1F523825"/>
     <w:multiLevelType w:val="multilevel"/>
     <w:tmpl w:val="64BA97AC"/>
@@ -1126,7 +2659,7 @@
       </w:pPr>
     </w:lvl>
   </w:abstractNum>
-  <w:abstractNum w:abstractNumId="3" w15:restartNumberingAfterBreak="0">
+  <w:abstractNum w:abstractNumId="5" w15:restartNumberingAfterBreak="0">
     <w:nsid w:val="2FF9243D"/>
     <w:multiLevelType w:val="multilevel"/>
     <w:tmpl w:val="CB8E940A"/>
@@ -1239,7 +2772,120 @@
       </w:pPr>
     </w:lvl>
   </w:abstractNum>
-  <w:abstractNum w:abstractNumId="4" w15:restartNumberingAfterBreak="0">
+  <w:abstractNum w:abstractNumId="6" w15:restartNumberingAfterBreak="0">
+    <w:nsid w:val="36A342EF"/>
+    <w:multiLevelType w:val="hybridMultilevel"/>
+    <w:tmpl w:val="07E68002"/>
+    <w:lvl w:ilvl="0" w:tplc="04090001">
+      <w:start w:val="1"/>
+      <w:numFmt w:val="bullet"/>
+      <w:lvlText w:val=""/>
+      <w:lvlJc w:val="left"/>
+      <w:pPr>
+        <w:ind w:left="1080" w:hanging="360"/>
+      </w:pPr>
+      <w:rPr>
+        <w:rFonts w:ascii="Symbol" w:hAnsi="Symbol" w:hint="default"/>
+      </w:rPr>
+    </w:lvl>
+    <w:lvl w:ilvl="1" w:tplc="04090003" w:tentative="1">
+      <w:start w:val="1"/>
+      <w:numFmt w:val="bullet"/>
+      <w:lvlText w:val="o"/>
+      <w:lvlJc w:val="left"/>
+      <w:pPr>
+        <w:ind w:left="1800" w:hanging="360"/>
+      </w:pPr>
+      <w:rPr>
+        <w:rFonts w:ascii="Courier New" w:hAnsi="Courier New" w:cs="Courier New" w:hint="default"/>
+      </w:rPr>
+    </w:lvl>
+    <w:lvl w:ilvl="2" w:tplc="04090005" w:tentative="1">
+      <w:start w:val="1"/>
+      <w:numFmt w:val="bullet"/>
+      <w:lvlText w:val=""/>
+      <w:lvlJc w:val="left"/>
+      <w:pPr>
+        <w:ind w:left="2520" w:hanging="360"/>
+      </w:pPr>
+      <w:rPr>
+        <w:rFonts w:ascii="Wingdings" w:hAnsi="Wingdings" w:hint="default"/>
+      </w:rPr>
+    </w:lvl>
+    <w:lvl w:ilvl="3" w:tplc="04090001" w:tentative="1">
+      <w:start w:val="1"/>
+      <w:numFmt w:val="bullet"/>
+      <w:lvlText w:val=""/>
+      <w:lvlJc w:val="left"/>
+      <w:pPr>
+        <w:ind w:left="3240" w:hanging="360"/>
+      </w:pPr>
+      <w:rPr>
+        <w:rFonts w:ascii="Symbol" w:hAnsi="Symbol" w:hint="default"/>
+      </w:rPr>
+    </w:lvl>
+    <w:lvl w:ilvl="4" w:tplc="04090003" w:tentative="1">
+      <w:start w:val="1"/>
+      <w:numFmt w:val="bullet"/>
+      <w:lvlText w:val="o"/>
+      <w:lvlJc w:val="left"/>
+      <w:pPr>
+        <w:ind w:left="3960" w:hanging="360"/>
+      </w:pPr>
+      <w:rPr>
+        <w:rFonts w:ascii="Courier New" w:hAnsi="Courier New" w:cs="Courier New" w:hint="default"/>
+      </w:rPr>
+    </w:lvl>
+    <w:lvl w:ilvl="5" w:tplc="04090005" w:tentative="1">
+      <w:start w:val="1"/>
+      <w:numFmt w:val="bullet"/>
+      <w:lvlText w:val=""/>
+      <w:lvlJc w:val="left"/>
+      <w:pPr>
+        <w:ind w:left="4680" w:hanging="360"/>
+      </w:pPr>
+      <w:rPr>
+        <w:rFonts w:ascii="Wingdings" w:hAnsi="Wingdings" w:hint="default"/>
+      </w:rPr>
+    </w:lvl>
+    <w:lvl w:ilvl="6" w:tplc="04090001" w:tentative="1">
+      <w:start w:val="1"/>
+      <w:numFmt w:val="bullet"/>
+      <w:lvlText w:val=""/>
+      <w:lvlJc w:val="left"/>
+      <w:pPr>
+        <w:ind w:left="5400" w:hanging="360"/>
+      </w:pPr>
+      <w:rPr>
+        <w:rFonts w:ascii="Symbol" w:hAnsi="Symbol" w:hint="default"/>
+      </w:rPr>
+    </w:lvl>
+    <w:lvl w:ilvl="7" w:tplc="04090003" w:tentative="1">
+      <w:start w:val="1"/>
+      <w:numFmt w:val="bullet"/>
+      <w:lvlText w:val="o"/>
+      <w:lvlJc w:val="left"/>
+      <w:pPr>
+        <w:ind w:left="6120" w:hanging="360"/>
+      </w:pPr>
+      <w:rPr>
+        <w:rFonts w:ascii="Courier New" w:hAnsi="Courier New" w:cs="Courier New" w:hint="default"/>
+      </w:rPr>
+    </w:lvl>
+    <w:lvl w:ilvl="8" w:tplc="04090005" w:tentative="1">
+      <w:start w:val="1"/>
+      <w:numFmt w:val="bullet"/>
+      <w:lvlText w:val=""/>
+      <w:lvlJc w:val="left"/>
+      <w:pPr>
+        <w:ind w:left="6840" w:hanging="360"/>
+      </w:pPr>
+      <w:rPr>
+        <w:rFonts w:ascii="Wingdings" w:hAnsi="Wingdings" w:hint="default"/>
+      </w:rPr>
+    </w:lvl>
+  </w:abstractNum>
+  <w:abstractNum w:abstractNumId="7" w15:restartNumberingAfterBreak="0">
     <w:nsid w:val="48DF548A"/>
     <w:multiLevelType w:val="multilevel"/>
     <w:tmpl w:val="DE90F8B0"/>
@@ -1377,7 +3023,7 @@
       </w:rPr>
     </w:lvl>
   </w:abstractNum>
-  <w:abstractNum w:abstractNumId="5" w15:restartNumberingAfterBreak="0">
+  <w:abstractNum w:abstractNumId="8" w15:restartNumberingAfterBreak="0">
     <w:nsid w:val="510E490A"/>
     <w:multiLevelType w:val="multilevel"/>
     <w:tmpl w:val="827C601E"/>
@@ -1494,7 +3140,7 @@
       </w:pPr>
     </w:lvl>
   </w:abstractNum>
-  <w:abstractNum w:abstractNumId="6" w15:restartNumberingAfterBreak="0">
+  <w:abstractNum w:abstractNumId="9" w15:restartNumberingAfterBreak="0">
     <w:nsid w:val="557B21A8"/>
     <w:multiLevelType w:val="multilevel"/>
     <w:tmpl w:val="D84C8D4C"/>
@@ -1643,7 +3289,7 @@
       </w:rPr>
     </w:lvl>
   </w:abstractNum>
-  <w:abstractNum w:abstractNumId="7" w15:restartNumberingAfterBreak="0">
+  <w:abstractNum w:abstractNumId="10" w15:restartNumberingAfterBreak="0">
     <w:nsid w:val="58074FA5"/>
     <w:multiLevelType w:val="multilevel"/>
     <w:tmpl w:val="509AB566"/>
@@ -1792,7 +3438,7 @@
       </w:rPr>
     </w:lvl>
   </w:abstractNum>
-  <w:abstractNum w:abstractNumId="8" w15:restartNumberingAfterBreak="0">
+  <w:abstractNum w:abstractNumId="11" w15:restartNumberingAfterBreak="0">
     <w:nsid w:val="5ED71624"/>
     <w:multiLevelType w:val="multilevel"/>
     <w:tmpl w:val="2A8A514E"/>
@@ -1909,7 +3555,7 @@
       </w:pPr>
     </w:lvl>
   </w:abstractNum>
-  <w:abstractNum w:abstractNumId="9" w15:restartNumberingAfterBreak="0">
+  <w:abstractNum w:abstractNumId="12" w15:restartNumberingAfterBreak="0">
     <w:nsid w:val="66047616"/>
     <w:multiLevelType w:val="multilevel"/>
     <w:tmpl w:val="64DE04DC"/>
@@ -2058,7 +3704,7 @@
       </w:rPr>
     </w:lvl>
   </w:abstractNum>
-  <w:abstractNum w:abstractNumId="10" w15:restartNumberingAfterBreak="0">
+  <w:abstractNum w:abstractNumId="13" w15:restartNumberingAfterBreak="0">
     <w:nsid w:val="6DA63EBC"/>
     <w:multiLevelType w:val="multilevel"/>
     <w:tmpl w:val="D04EB668"/>
@@ -2207,7 +3853,7 @@
       </w:rPr>
     </w:lvl>
   </w:abstractNum>
-  <w:abstractNum w:abstractNumId="11" w15:restartNumberingAfterBreak="0">
+  <w:abstractNum w:abstractNumId="14" w15:restartNumberingAfterBreak="0">
     <w:nsid w:val="7A914E35"/>
     <w:multiLevelType w:val="multilevel"/>
     <w:tmpl w:val="0768836C"/>
@@ -2356,7 +4002,120 @@
       </w:rPr>
     </w:lvl>
   </w:abstractNum>
-  <w:abstractNum w:abstractNumId="12" w15:restartNumberingAfterBreak="0">
+  <w:abstractNum w:abstractNumId="15" w15:restartNumberingAfterBreak="0">
+    <w:nsid w:val="7BC50F5C"/>
+    <w:multiLevelType w:val="hybridMultilevel"/>
+    <w:tmpl w:val="D9B23344"/>
+    <w:lvl w:ilvl="0" w:tplc="04090001">
+      <w:start w:val="1"/>
+      <w:numFmt w:val="bullet"/>
+      <w:lvlText w:val=""/>
+      <w:lvlJc w:val="left"/>
+      <w:pPr>
+        <w:ind w:left="1080" w:hanging="360"/>
+      </w:pPr>
+      <w:rPr>
+        <w:rFonts w:ascii="Symbol" w:hAnsi="Symbol" w:hint="default"/>
+      </w:rPr>
+    </w:lvl>
+    <w:lvl w:ilvl="1" w:tplc="04090003" w:tentative="1">
+      <w:start w:val="1"/>
+      <w:numFmt w:val="bullet"/>
+      <w:lvlText w:val="o"/>
+      <w:lvlJc w:val="left"/>
+      <w:pPr>
+        <w:ind w:left="1800" w:hanging="360"/>
+      </w:pPr>
+      <w:rPr>
+        <w:rFonts w:ascii="Courier New" w:hAnsi="Courier New" w:cs="Courier New" w:hint="default"/>
+      </w:rPr>
+    </w:lvl>
+    <w:lvl w:ilvl="2" w:tplc="04090005" w:tentative="1">
+      <w:start w:val="1"/>
+      <w:numFmt w:val="bullet"/>
+      <w:lvlText w:val=""/>
+      <w:lvlJc w:val="left"/>
+      <w:pPr>
+        <w:ind w:left="2520" w:hanging="360"/>
+      </w:pPr>
+      <w:rPr>
+        <w:rFonts w:ascii="Wingdings" w:hAnsi="Wingdings" w:hint="default"/>
+      </w:rPr>
+    </w:lvl>
+    <w:lvl w:ilvl="3" w:tplc="04090001" w:tentative="1">
+      <w:start w:val="1"/>
+      <w:numFmt w:val="bullet"/>
+      <w:lvlText w:val=""/>
+      <w:lvlJc w:val="left"/>
+      <w:pPr>
+        <w:ind w:left="3240" w:hanging="360"/>
+      </w:pPr>
+      <w:rPr>
+        <w:rFonts w:ascii="Symbol" w:hAnsi="Symbol" w:hint="default"/>
+      </w:rPr>
+    </w:lvl>
+    <w:lvl w:ilvl="4" w:tplc="04090003" w:tentative="1">
+      <w:start w:val="1"/>
+      <w:numFmt w:val="bullet"/>
+      <w:lvlText w:val="o"/>
+      <w:lvlJc w:val="left"/>
+      <w:pPr>
+        <w:ind w:left="3960" w:hanging="360"/>
+      </w:pPr>
+      <w:rPr>
+        <w:rFonts w:ascii="Courier New" w:hAnsi="Courier New" w:cs="Courier New" w:hint="default"/>
+      </w:rPr>
+    </w:lvl>
+    <w:lvl w:ilvl="5" w:tplc="04090005" w:tentative="1">
+      <w:start w:val="1"/>
+      <w:numFmt w:val="bullet"/>
+      <w:lvlText w:val=""/>
+      <w:lvlJc w:val="left"/>
+      <w:pPr>
+        <w:ind w:left="4680" w:hanging="360"/>
+      </w:pPr>
+      <w:rPr>
+        <w:rFonts w:ascii="Wingdings" w:hAnsi="Wingdings" w:hint="default"/>
+      </w:rPr>
+    </w:lvl>
+    <w:lvl w:ilvl="6" w:tplc="04090001" w:tentative="1">
+      <w:start w:val="1"/>
+      <w:numFmt w:val="bullet"/>
+      <w:lvlText w:val=""/>
+      <w:lvlJc w:val="left"/>
+      <w:pPr>
+        <w:ind w:left="5400" w:hanging="360"/>
+      </w:pPr>
+      <w:rPr>
+        <w:rFonts w:ascii="Symbol" w:hAnsi="Symbol" w:hint="default"/>
+      </w:rPr>
+    </w:lvl>
+    <w:lvl w:ilvl="7" w:tplc="04090003" w:tentative="1">
+      <w:start w:val="1"/>
+      <w:numFmt w:val="bullet"/>
+      <w:lvlText w:val="o"/>
+      <w:lvlJc w:val="left"/>
+      <w:pPr>
+        <w:ind w:left="6120" w:hanging="360"/>
+      </w:pPr>
+      <w:rPr>
+        <w:rFonts w:ascii="Courier New" w:hAnsi="Courier New" w:cs="Courier New" w:hint="default"/>
+      </w:rPr>
+    </w:lvl>
+    <w:lvl w:ilvl="8" w:tplc="04090005" w:tentative="1">
+      <w:start w:val="1"/>
+      <w:numFmt w:val="bullet"/>
+      <w:lvlText w:val=""/>
+      <w:lvlJc w:val="left"/>
+      <w:pPr>
+        <w:ind w:left="6840" w:hanging="360"/>
+      </w:pPr>
+      <w:rPr>
+        <w:rFonts w:ascii="Wingdings" w:hAnsi="Wingdings" w:hint="default"/>
+      </w:rPr>
+    </w:lvl>
+  </w:abstractNum>
+  <w:abstractNum w:abstractNumId="16" w15:restartNumberingAfterBreak="0">
     <w:nsid w:val="7BD037B6"/>
     <w:multiLevelType w:val="multilevel"/>
     <w:tmpl w:val="DCDECE4C"/>
@@ -2469,7 +4228,120 @@
       </w:pPr>
     </w:lvl>
   </w:abstractNum>
-  <w:abstractNum w:abstractNumId="13" w15:restartNumberingAfterBreak="0">
+  <w:abstractNum w:abstractNumId="17" w15:restartNumberingAfterBreak="0">
+    <w:nsid w:val="7E374A98"/>
+    <w:multiLevelType w:val="hybridMultilevel"/>
+    <w:tmpl w:val="DB0C0ADE"/>
+    <w:lvl w:ilvl="0" w:tplc="04090001">
+      <w:start w:val="1"/>
+      <w:numFmt w:val="bullet"/>
+      <w:lvlText w:val=""/>
+      <w:lvlJc w:val="left"/>
+      <w:pPr>
+        <w:ind w:left="1080" w:hanging="360"/>
+      </w:pPr>
+      <w:rPr>
+        <w:rFonts w:ascii="Symbol" w:hAnsi="Symbol" w:hint="default"/>
+      </w:rPr>
+    </w:lvl>
+    <w:lvl w:ilvl="1" w:tplc="04090003" w:tentative="1">
+      <w:start w:val="1"/>
+      <w:numFmt w:val="bullet"/>
+      <w:lvlText w:val="o"/>
+      <w:lvlJc w:val="left"/>
+      <w:pPr>
+        <w:ind w:left="1800" w:hanging="360"/>
+      </w:pPr>
+      <w:rPr>
+        <w:rFonts w:ascii="Courier New" w:hAnsi="Courier New" w:cs="Courier New" w:hint="default"/>
+      </w:rPr>
+    </w:lvl>
+    <w:lvl w:ilvl="2" w:tplc="04090005" w:tentative="1">
+      <w:start w:val="1"/>
+      <w:numFmt w:val="bullet"/>
+      <w:lvlText w:val=""/>
+      <w:lvlJc w:val="left"/>
+      <w:pPr>
+        <w:ind w:left="2520" w:hanging="360"/>
+      </w:pPr>
+      <w:rPr>
+        <w:rFonts w:ascii="Wingdings" w:hAnsi="Wingdings" w:hint="default"/>
+      </w:rPr>
+    </w:lvl>
+    <w:lvl w:ilvl="3" w:tplc="04090001" w:tentative="1">
+      <w:start w:val="1"/>
+      <w:numFmt w:val="bullet"/>
+      <w:lvlText w:val=""/>
+      <w:lvlJc w:val="left"/>
+      <w:pPr>
+        <w:ind w:left="3240" w:hanging="360"/>
+      </w:pPr>
+      <w:rPr>
+        <w:rFonts w:ascii="Symbol" w:hAnsi="Symbol" w:hint="default"/>
+      </w:rPr>
+    </w:lvl>
+    <w:lvl w:ilvl="4" w:tplc="04090003" w:tentative="1">
+      <w:start w:val="1"/>
+      <w:numFmt w:val="bullet"/>
+      <w:lvlText w:val="o"/>
+      <w:lvlJc w:val="left"/>
+      <w:pPr>
+        <w:ind w:left="3960" w:hanging="360"/>
+      </w:pPr>
+      <w:rPr>
+        <w:rFonts w:ascii="Courier New" w:hAnsi="Courier New" w:cs="Courier New" w:hint="default"/>
+      </w:rPr>
+    </w:lvl>
+    <w:lvl w:ilvl="5" w:tplc="04090005" w:tentative="1">
+      <w:start w:val="1"/>
+      <w:numFmt w:val="bullet"/>
+      <w:lvlText w:val=""/>
+      <w:lvlJc w:val="left"/>
+      <w:pPr>
+        <w:ind w:left="4680" w:hanging="360"/>
+      </w:pPr>
+      <w:rPr>
+        <w:rFonts w:ascii="Wingdings" w:hAnsi="Wingdings" w:hint="default"/>
+      </w:rPr>
+    </w:lvl>
+    <w:lvl w:ilvl="6" w:tplc="04090001" w:tentative="1">
+      <w:start w:val="1"/>
+      <w:numFmt w:val="bullet"/>
+      <w:lvlText w:val=""/>
+      <w:lvlJc w:val="left"/>
+      <w:pPr>
+        <w:ind w:left="5400" w:hanging="360"/>
+      </w:pPr>
+      <w:rPr>
+        <w:rFonts w:ascii="Symbol" w:hAnsi="Symbol" w:hint="default"/>
+      </w:rPr>
+    </w:lvl>
+    <w:lvl w:ilvl="7" w:tplc="04090003" w:tentative="1">
+      <w:start w:val="1"/>
+      <w:numFmt w:val="bullet"/>
+      <w:lvlText w:val="o"/>
+      <w:lvlJc w:val="left"/>
+      <w:pPr>
+        <w:ind w:left="6120" w:hanging="360"/>
+      </w:pPr>
+      <w:rPr>
+        <w:rFonts w:ascii="Courier New" w:hAnsi="Courier New" w:cs="Courier New" w:hint="default"/>
+      </w:rPr>
+    </w:lvl>
+    <w:lvl w:ilvl="8" w:tplc="04090005" w:tentative="1">
+      <w:start w:val="1"/>
+      <w:numFmt w:val="bullet"/>
+      <w:lvlText w:val=""/>
+      <w:lvlJc w:val="left"/>
+      <w:pPr>
+        <w:ind w:left="6840" w:hanging="360"/>
+      </w:pPr>
+      <w:rPr>
+        <w:rFonts w:ascii="Wingdings" w:hAnsi="Wingdings" w:hint="default"/>
+      </w:rPr>
+    </w:lvl>
+  </w:abstractNum>
+  <w:abstractNum w:abstractNumId="18" w15:restartNumberingAfterBreak="0">
     <w:nsid w:val="7FA77BD4"/>
     <w:multiLevelType w:val="multilevel"/>
     <w:tmpl w:val="9A38F7CE"/>
@@ -2587,46 +4459,61 @@
     </w:lvl>
   </w:abstractNum>
   <w:num w:numId="1" w16cid:durableId="1585914580">
-    <w:abstractNumId w:val="1"/>
+    <w:abstractNumId w:val="2"/>
   </w:num>
   <w:num w:numId="2" w16cid:durableId="2085495234">
+    <w:abstractNumId w:val="7"/>
+  </w:num>
+  <w:num w:numId="3" w16cid:durableId="199098527">
     <w:abstractNumId w:val="4"/>
   </w:num>
-  <w:num w:numId="3" w16cid:durableId="199098527">
-    <w:abstractNumId w:val="2"/>
+  <w:num w:numId="4" w16cid:durableId="860972517">
+    <w:abstractNumId w:val="18"/>
   </w:num>
-  <w:num w:numId="4" w16cid:durableId="860972517">
+  <w:num w:numId="5" w16cid:durableId="1245382851">
+    <w:abstractNumId w:val="11"/>
+  </w:num>
+  <w:num w:numId="6" w16cid:durableId="1758675041">
+    <w:abstractNumId w:val="8"/>
+  </w:num>
+  <w:num w:numId="7" w16cid:durableId="56247709">
+    <w:abstractNumId w:val="12"/>
+  </w:num>
+  <w:num w:numId="8" w16cid:durableId="1165975295">
+    <w:abstractNumId w:val="10"/>
+  </w:num>
+  <w:num w:numId="9" w16cid:durableId="677737302">
+    <w:abstractNumId w:val="14"/>
+  </w:num>
+  <w:num w:numId="10" w16cid:durableId="872351428">
     <w:abstractNumId w:val="13"/>
   </w:num>
-  <w:num w:numId="5" w16cid:durableId="1245382851">
-    <w:abstractNumId w:val="8"/>
+  <w:num w:numId="11" w16cid:durableId="282033268">
+    <w:abstractNumId w:val="9"/>
   </w:num>
-  <w:num w:numId="6" w16cid:durableId="1758675041">
+  <w:num w:numId="12" w16cid:durableId="1900898234">
     <w:abstractNumId w:val="5"/>
   </w:num>
-  <w:num w:numId="7" w16cid:durableId="56247709">
-    <w:abstractNumId w:val="9"/>
-  </w:num>
-  <w:num w:numId="8" w16cid:durableId="1165975295">
-    <w:abstractNumId w:val="7"/>
-  </w:num>
-  <w:num w:numId="9" w16cid:durableId="677737302">
-    <w:abstractNumId w:val="11"/>
-  </w:num>
-  <w:num w:numId="10" w16cid:durableId="872351428">
-    <w:abstractNumId w:val="10"/>
-  </w:num>
-  <w:num w:numId="11" w16cid:durableId="282033268">
-    <w:abstractNumId w:val="6"/>
-  </w:num>
-  <w:num w:numId="12" w16cid:durableId="1900898234">
-    <w:abstractNumId w:val="3"/>
-  </w:num>
   <w:num w:numId="13" w16cid:durableId="1921285434">
-    <w:abstractNumId w:val="12"/>
+    <w:abstractNumId w:val="16"/>
   </w:num>
   <w:num w:numId="14" w16cid:durableId="54474949">
     <w:abstractNumId w:val="0"/>
+  </w:num>
+  <w:num w:numId="15" w16cid:durableId="870190040">
+    <w:abstractNumId w:val="3"/>
+  </w:num>
+  <w:num w:numId="16" w16cid:durableId="2028553356">
+    <w:abstractNumId w:val="17"/>
+  </w:num>
+  <w:num w:numId="17" w16cid:durableId="591014610">
+    <w:abstractNumId w:val="1"/>
+  </w:num>
+  <w:num w:numId="18" w16cid:durableId="406151587">
+    <w:abstractNumId w:val="15"/>
+  </w:num>
+  <w:num w:numId="19" w16cid:durableId="1296522490">
+    <w:abstractNumId w:val="6"/>
   </w:num>
   <w:numIdMacAtCleanup w:val="7"/>
 </w:numbering>
@@ -3032,7 +4919,7 @@
   <w:style w:type="paragraph" w:default="1" w:styleId="Normal">
     <w:name w:val="Normal"/>
     <w:qFormat/>
-    <w:rsid w:val="00A734E0"/>
+    <w:rsid w:val="00E44384"/>
   </w:style>
   <w:style w:type="paragraph" w:styleId="Heading1">
     <w:name w:val="heading 1"/>

</xml_diff>